<commit_message>
commit doc and read me
</commit_message>
<xml_diff>
--- a/DI.docx
+++ b/DI.docx
@@ -171,10 +171,7 @@
               <w:t>-</w:t>
             </w:r>
             <w:r>
-              <w:t xml:space="preserve"> </w:t>
-            </w:r>
-            <w:r>
-              <w:t>instantiating objects within a class, those objects are passed in as parameters to the class like passing it to the Constructor of the method instead.</w:t>
+              <w:t xml:space="preserve"> instantiating objects within a class, those objects are passed in as parameters to the class like passing it to the Constructor of the method instead.</w:t>
             </w:r>
           </w:p>
         </w:tc>
@@ -277,7 +274,13 @@
             </w:r>
             <w:proofErr w:type="spellEnd"/>
             <w:r>
-              <w:t xml:space="preserve"> file.</w:t>
+              <w:t xml:space="preserve"> file</w:t>
+            </w:r>
+            <w:r>
+              <w:t xml:space="preserve"> (in old version)</w:t>
+            </w:r>
+            <w:r>
+              <w:t>.</w:t>
             </w:r>
           </w:p>
           <w:p/>
@@ -357,7 +360,7 @@
                           <pic:cNvPicPr/>
                         </pic:nvPicPr>
                         <pic:blipFill>
-                          <a:blip r:embed="rId5"/>
+                          <a:blip r:embed="rId7"/>
                           <a:stretch>
                             <a:fillRect/>
                           </a:stretch>
@@ -404,7 +407,7 @@
                           <pic:cNvPicPr/>
                         </pic:nvPicPr>
                         <pic:blipFill>
-                          <a:blip r:embed="rId6"/>
+                          <a:blip r:embed="rId8"/>
                           <a:stretch>
                             <a:fillRect/>
                           </a:stretch>
@@ -512,8 +515,13 @@
         <w:spacing w:after="0"/>
       </w:pPr>
       <w:r>
-        <w:t>Public MyController</w:t>
-      </w:r>
+        <w:t xml:space="preserve">Public </w:t>
+      </w:r>
+      <w:proofErr w:type="spellStart"/>
+      <w:r>
+        <w:t>MyController</w:t>
+      </w:r>
+      <w:proofErr w:type="spellEnd"/>
       <w:r>
         <w:t xml:space="preserve"> </w:t>
       </w:r>
@@ -954,7 +962,7 @@
                     </pic:cNvPicPr>
                   </pic:nvPicPr>
                   <pic:blipFill>
-                    <a:blip r:embed="rId7">
+                    <a:blip r:embed="rId9">
                       <a:extLst>
                         <a:ext uri="{28A0092B-C50C-407E-A947-70E740481C1C}">
                           <a14:useLocalDpi xmlns:a14="http://schemas.microsoft.com/office/drawing/2010/main" val="0"/>
@@ -1058,7 +1066,7 @@
                     </pic:cNvPicPr>
                   </pic:nvPicPr>
                   <pic:blipFill>
-                    <a:blip r:embed="rId8">
+                    <a:blip r:embed="rId10">
                       <a:extLst>
                         <a:ext uri="{28A0092B-C50C-407E-A947-70E740481C1C}">
                           <a14:useLocalDpi xmlns:a14="http://schemas.microsoft.com/office/drawing/2010/main" val="0"/>
@@ -1401,7 +1409,7 @@
                     <pic:cNvPicPr/>
                   </pic:nvPicPr>
                   <pic:blipFill>
-                    <a:blip r:embed="rId9"/>
+                    <a:blip r:embed="rId11"/>
                     <a:stretch>
                       <a:fillRect/>
                     </a:stretch>
@@ -1512,6 +1520,56 @@
     </w:sectPr>
   </w:body>
 </w:document>
+</file>
+
+<file path=word/endnotes.xml><?xml version="1.0" encoding="utf-8"?>
+<w:endnotes xmlns:wpc="http://schemas.microsoft.com/office/word/2010/wordprocessingCanvas" xmlns:cx="http://schemas.microsoft.com/office/drawing/2014/chartex" xmlns:cx1="http://schemas.microsoft.com/office/drawing/2015/9/8/chartex" xmlns:cx2="http://schemas.microsoft.com/office/drawing/2015/10/21/chartex" xmlns:cx3="http://schemas.microsoft.com/office/drawing/2016/5/9/chartex" xmlns:cx4="http://schemas.microsoft.com/office/drawing/2016/5/10/chartex" xmlns:cx5="http://schemas.microsoft.com/office/drawing/2016/5/11/chartex" xmlns:cx6="http://schemas.microsoft.com/office/drawing/2016/5/12/chartex" xmlns:cx7="http://schemas.microsoft.com/office/drawing/2016/5/13/chartex" xmlns:cx8="http://schemas.microsoft.com/office/drawing/2016/5/14/chartex" xmlns:mc="http://schemas.openxmlformats.org/markup-compatibility/2006" xmlns:aink="http://schemas.microsoft.com/office/drawing/2016/ink" xmlns:am3d="http://schemas.microsoft.com/office/drawing/2017/model3d" xmlns:o="urn:schemas-microsoft-com:office:office" xmlns:oel="http://schemas.microsoft.com/office/2019/extlst" xmlns:r="http://schemas.openxmlformats.org/officeDocument/2006/relationships" xmlns:m="http://schemas.openxmlformats.org/officeDocument/2006/math" xmlns:v="urn:schemas-microsoft-com:vml" xmlns:wp14="http://schemas.microsoft.com/office/word/2010/wordprocessingDrawing" xmlns:wp="http://schemas.openxmlformats.org/drawingml/2006/wordprocessingDrawing" xmlns:w10="urn:schemas-microsoft-com:office:word" xmlns:w="http://schemas.openxmlformats.org/wordprocessingml/2006/main" xmlns:w14="http://schemas.microsoft.com/office/word/2010/wordml" xmlns:w15="http://schemas.microsoft.com/office/word/2012/wordml" xmlns:w16cex="http://schemas.microsoft.com/office/word/2018/wordml/cex" xmlns:w16cid="http://schemas.microsoft.com/office/word/2016/wordml/cid" xmlns:w16="http://schemas.microsoft.com/office/word/2018/wordml" xmlns:w16du="http://schemas.microsoft.com/office/word/2023/wordml/word16du" xmlns:w16sdtdh="http://schemas.microsoft.com/office/word/2020/wordml/sdtdatahash" xmlns:w16sdtfl="http://schemas.microsoft.com/office/word/2024/wordml/sdtformatlock" xmlns:w16se="http://schemas.microsoft.com/office/word/2015/wordml/symex" xmlns:wpg="http://schemas.microsoft.com/office/word/2010/wordprocessingGroup" xmlns:wpi="http://schemas.microsoft.com/office/word/2010/wordprocessingInk" xmlns:wne="http://schemas.microsoft.com/office/word/2006/wordml" xmlns:wps="http://schemas.microsoft.com/office/word/2010/wordprocessingShape" mc:Ignorable="w14 w15 w16se w16cid w16 w16cex w16sdtdh w16sdtfl w16du wp14">
+  <w:endnote w:type="separator" w:id="-1">
+    <w:p>
+      <w:pPr>
+        <w:spacing w:after="0" w:line="240" w:lineRule="auto"/>
+      </w:pPr>
+      <w:r>
+        <w:separator/>
+      </w:r>
+    </w:p>
+  </w:endnote>
+  <w:endnote w:type="continuationSeparator" w:id="0">
+    <w:p>
+      <w:pPr>
+        <w:spacing w:after="0" w:line="240" w:lineRule="auto"/>
+      </w:pPr>
+      <w:r>
+        <w:continuationSeparator/>
+      </w:r>
+    </w:p>
+  </w:endnote>
+</w:endnotes>
+</file>
+
+<file path=word/footnotes.xml><?xml version="1.0" encoding="utf-8"?>
+<w:footnotes xmlns:wpc="http://schemas.microsoft.com/office/word/2010/wordprocessingCanvas" xmlns:cx="http://schemas.microsoft.com/office/drawing/2014/chartex" xmlns:cx1="http://schemas.microsoft.com/office/drawing/2015/9/8/chartex" xmlns:cx2="http://schemas.microsoft.com/office/drawing/2015/10/21/chartex" xmlns:cx3="http://schemas.microsoft.com/office/drawing/2016/5/9/chartex" xmlns:cx4="http://schemas.microsoft.com/office/drawing/2016/5/10/chartex" xmlns:cx5="http://schemas.microsoft.com/office/drawing/2016/5/11/chartex" xmlns:cx6="http://schemas.microsoft.com/office/drawing/2016/5/12/chartex" xmlns:cx7="http://schemas.microsoft.com/office/drawing/2016/5/13/chartex" xmlns:cx8="http://schemas.microsoft.com/office/drawing/2016/5/14/chartex" xmlns:mc="http://schemas.openxmlformats.org/markup-compatibility/2006" xmlns:aink="http://schemas.microsoft.com/office/drawing/2016/ink" xmlns:am3d="http://schemas.microsoft.com/office/drawing/2017/model3d" xmlns:o="urn:schemas-microsoft-com:office:office" xmlns:oel="http://schemas.microsoft.com/office/2019/extlst" xmlns:r="http://schemas.openxmlformats.org/officeDocument/2006/relationships" xmlns:m="http://schemas.openxmlformats.org/officeDocument/2006/math" xmlns:v="urn:schemas-microsoft-com:vml" xmlns:wp14="http://schemas.microsoft.com/office/word/2010/wordprocessingDrawing" xmlns:wp="http://schemas.openxmlformats.org/drawingml/2006/wordprocessingDrawing" xmlns:w10="urn:schemas-microsoft-com:office:word" xmlns:w="http://schemas.openxmlformats.org/wordprocessingml/2006/main" xmlns:w14="http://schemas.microsoft.com/office/word/2010/wordml" xmlns:w15="http://schemas.microsoft.com/office/word/2012/wordml" xmlns:w16cex="http://schemas.microsoft.com/office/word/2018/wordml/cex" xmlns:w16cid="http://schemas.microsoft.com/office/word/2016/wordml/cid" xmlns:w16="http://schemas.microsoft.com/office/word/2018/wordml" xmlns:w16du="http://schemas.microsoft.com/office/word/2023/wordml/word16du" xmlns:w16sdtdh="http://schemas.microsoft.com/office/word/2020/wordml/sdtdatahash" xmlns:w16sdtfl="http://schemas.microsoft.com/office/word/2024/wordml/sdtformatlock" xmlns:w16se="http://schemas.microsoft.com/office/word/2015/wordml/symex" xmlns:wpg="http://schemas.microsoft.com/office/word/2010/wordprocessingGroup" xmlns:wpi="http://schemas.microsoft.com/office/word/2010/wordprocessingInk" xmlns:wne="http://schemas.microsoft.com/office/word/2006/wordml" xmlns:wps="http://schemas.microsoft.com/office/word/2010/wordprocessingShape" mc:Ignorable="w14 w15 w16se w16cid w16 w16cex w16sdtdh w16sdtfl w16du wp14">
+  <w:footnote w:type="separator" w:id="-1">
+    <w:p>
+      <w:pPr>
+        <w:spacing w:after="0" w:line="240" w:lineRule="auto"/>
+      </w:pPr>
+      <w:r>
+        <w:separator/>
+      </w:r>
+    </w:p>
+  </w:footnote>
+  <w:footnote w:type="continuationSeparator" w:id="0">
+    <w:p>
+      <w:pPr>
+        <w:spacing w:after="0" w:line="240" w:lineRule="auto"/>
+      </w:pPr>
+      <w:r>
+        <w:continuationSeparator/>
+      </w:r>
+    </w:p>
+  </w:footnote>
+</w:footnotes>
 </file>
 
 <file path=word/numbering.xml><?xml version="1.0" encoding="utf-8"?>
@@ -2504,6 +2562,7 @@
   <w:style w:type="character" w:default="1" w:styleId="DefaultParagraphFont">
     <w:name w:val="Default Paragraph Font"/>
     <w:uiPriority w:val="1"/>
+    <w:semiHidden/>
     <w:unhideWhenUsed/>
   </w:style>
   <w:style w:type="table" w:default="1" w:styleId="TableNormal">
@@ -2870,6 +2929,50 @@
       <w:color w:val="96607D" w:themeColor="followedHyperlink"/>
       <w:u w:val="single"/>
     </w:rPr>
+  </w:style>
+  <w:style w:type="paragraph" w:styleId="Header">
+    <w:name w:val="header"/>
+    <w:basedOn w:val="Normal"/>
+    <w:link w:val="HeaderChar"/>
+    <w:uiPriority w:val="99"/>
+    <w:unhideWhenUsed/>
+    <w:rsid w:val="00656EBB"/>
+    <w:pPr>
+      <w:tabs>
+        <w:tab w:val="center" w:pos="4513"/>
+        <w:tab w:val="right" w:pos="9026"/>
+      </w:tabs>
+      <w:spacing w:after="0" w:line="240" w:lineRule="auto"/>
+    </w:pPr>
+  </w:style>
+  <w:style w:type="character" w:customStyle="1" w:styleId="HeaderChar">
+    <w:name w:val="Header Char"/>
+    <w:basedOn w:val="DefaultParagraphFont"/>
+    <w:link w:val="Header"/>
+    <w:uiPriority w:val="99"/>
+    <w:rsid w:val="00656EBB"/>
+  </w:style>
+  <w:style w:type="paragraph" w:styleId="Footer">
+    <w:name w:val="footer"/>
+    <w:basedOn w:val="Normal"/>
+    <w:link w:val="FooterChar"/>
+    <w:uiPriority w:val="99"/>
+    <w:unhideWhenUsed/>
+    <w:rsid w:val="00656EBB"/>
+    <w:pPr>
+      <w:tabs>
+        <w:tab w:val="center" w:pos="4513"/>
+        <w:tab w:val="right" w:pos="9026"/>
+      </w:tabs>
+      <w:spacing w:after="0" w:line="240" w:lineRule="auto"/>
+    </w:pPr>
+  </w:style>
+  <w:style w:type="character" w:customStyle="1" w:styleId="FooterChar">
+    <w:name w:val="Footer Char"/>
+    <w:basedOn w:val="DefaultParagraphFont"/>
+    <w:link w:val="Footer"/>
+    <w:uiPriority w:val="99"/>
+    <w:rsid w:val="00656EBB"/>
   </w:style>
 </w:styles>
 </file>

</xml_diff>